<commit_message>
Add presentación del proyecto Maquila MTO KMAT (HTML) y actualiza script de pruebas VA01
- Presentación HTML autocontenida con logo Aliacer y secciones de entregables, pedido y siguientes pasos
- TC-01 (VA01) del script de pruebas actualizado con datos del pedido real 4010030435 y resultados OK
- .gitignore: excluye node_modules, sesión de Playwright (pw/userdata) y respaldos

Co-Authored-By: Claude Opus 4.7 (1M context) <noreply@anthropic.com>
</commit_message>
<xml_diff>
--- a/Proyecto-IA/manual-maquila-kmat/script-pruebas-maquila-kmat.docx
+++ b/Proyecto-IA/manual-maquila-kmat/script-pruebas-maquila-kmat.docx
@@ -996,7 +996,7 @@
           <w:color w:val="333333"/>
           <w:sz w:val="20"/>
         </w:rPr>
-        <w:t>Precondiciones: Cliente 100245 activo. Material KMAT-LAM-001 con perfil de configuración asignado.</w:t>
+        <w:t>Precondiciones: Cliente GILM000002 (INDALUM) activo. Material KMAT 43000005 (CFG DOBLEZ MAQUILA) con perfil de configuración.</w:t>
       </w:r>
     </w:p>
     <w:tbl>
@@ -1302,6 +1302,14 @@
                 <w:sz w:val="18"/>
               </w:rPr>
             </w:pPr>
+            <w:r>
+              <w:rPr>
+                <w:rFonts w:ascii="Calibri" w:hAnsi="Calibri" w:cs="Calibri"/>
+                <w:color w:val="333333"/>
+                <w:sz w:val="18"/>
+              </w:rPr>
+              <w:t xml:space="preserve">Se abrió la pantalla inicial de VA01.</w:t>
+            </w:r>
           </w:p>
         </w:tc>
         <w:tc>
@@ -1317,6 +1325,14 @@
                 <w:sz w:val="18"/>
               </w:rPr>
             </w:pPr>
+            <w:r>
+              <w:rPr>
+                <w:rFonts w:ascii="Calibri" w:hAnsi="Calibri" w:cs="Calibri"/>
+                <w:color w:val="333333"/>
+                <w:sz w:val="18"/>
+              </w:rPr>
+              <w:t xml:space="preserve">OK</w:t>
+            </w:r>
           </w:p>
         </w:tc>
       </w:tr>
@@ -1392,7 +1408,7 @@
                 <w:color w:val="333333"/>
                 <w:sz w:val="18"/>
               </w:rPr>
-              <w:t>Clase: OR · Org.ventas: 1000 · Canal: 10 · Sector: 00</w:t>
+              <w:t>Clase: ZMAQ · Org.ventas: LM00 · Canal: 50 · Sector: 00</w:t>
             </w:r>
           </w:p>
         </w:tc>
@@ -1432,6 +1448,14 @@
                 <w:sz w:val="18"/>
               </w:rPr>
             </w:pPr>
+            <w:r>
+              <w:rPr>
+                <w:rFonts w:ascii="Calibri" w:hAnsi="Calibri" w:cs="Calibri"/>
+                <w:color w:val="333333"/>
+                <w:sz w:val="18"/>
+              </w:rPr>
+              <w:t xml:space="preserve">Aceptó ZMAQ / LM00 / 50 / 00 (Perfiles LM, Filial, ComÚn) y mostró el resumen.</w:t>
+            </w:r>
           </w:p>
         </w:tc>
         <w:tc>
@@ -1447,6 +1471,14 @@
                 <w:sz w:val="18"/>
               </w:rPr>
             </w:pPr>
+            <w:r>
+              <w:rPr>
+                <w:rFonts w:ascii="Calibri" w:hAnsi="Calibri" w:cs="Calibri"/>
+                <w:color w:val="333333"/>
+                <w:sz w:val="18"/>
+              </w:rPr>
+              <w:t xml:space="preserve">OK</w:t>
+            </w:r>
           </w:p>
         </w:tc>
       </w:tr>
@@ -1522,7 +1554,7 @@
                 <w:color w:val="333333"/>
                 <w:sz w:val="18"/>
               </w:rPr>
-              <w:t>Solicitante: 100245 · Fecha entrega: 15.06.2026</w:t>
+              <w:t>Solicitante: GILM000002 (INDALUM) · Referencia cliente: Prueba Claude · Fecha entrega: 22.05.2026</w:t>
             </w:r>
           </w:p>
         </w:tc>
@@ -1562,6 +1594,14 @@
                 <w:sz w:val="18"/>
               </w:rPr>
             </w:pPr>
+            <w:r>
+              <w:rPr>
+                <w:rFonts w:ascii="Calibri" w:hAnsi="Calibri" w:cs="Calibri"/>
+                <w:color w:val="333333"/>
+                <w:sz w:val="18"/>
+              </w:rPr>
+              <w:t xml:space="preserve">Cargó el cliente GILM000002 (INDALUM); referencia y fecha aceptadas.</w:t>
+            </w:r>
           </w:p>
         </w:tc>
         <w:tc>
@@ -1577,6 +1617,14 @@
                 <w:sz w:val="18"/>
               </w:rPr>
             </w:pPr>
+            <w:r>
+              <w:rPr>
+                <w:rFonts w:ascii="Calibri" w:hAnsi="Calibri" w:cs="Calibri"/>
+                <w:color w:val="333333"/>
+                <w:sz w:val="18"/>
+              </w:rPr>
+              <w:t xml:space="preserve">OK</w:t>
+            </w:r>
           </w:p>
         </w:tc>
       </w:tr>
@@ -1652,7 +1700,7 @@
                 <w:color w:val="333333"/>
                 <w:sz w:val="18"/>
               </w:rPr>
-              <w:t>Material: KMAT-LAM-001 · Cantidad: 50000 KG</w:t>
+              <w:t>Material: 43000005 (CFG DOBLEZ MAQUILA) · Cantidad: 50 KG</w:t>
             </w:r>
           </w:p>
         </w:tc>
@@ -1692,6 +1740,14 @@
                 <w:sz w:val="18"/>
               </w:rPr>
             </w:pPr>
+            <w:r>
+              <w:rPr>
+                <w:rFonts w:ascii="Calibri" w:hAnsi="Calibri" w:cs="Calibri"/>
+                <w:color w:val="333333"/>
+                <w:sz w:val="18"/>
+              </w:rPr>
+              <w:t xml:space="preserve">Material 43000005 reconocido (CFG DOBLEZ MAQUILA); abrió la configuración.</w:t>
+            </w:r>
           </w:p>
         </w:tc>
         <w:tc>
@@ -1707,6 +1763,14 @@
                 <w:sz w:val="18"/>
               </w:rPr>
             </w:pPr>
+            <w:r>
+              <w:rPr>
+                <w:rFonts w:ascii="Calibri" w:hAnsi="Calibri" w:cs="Calibri"/>
+                <w:color w:val="333333"/>
+                <w:sz w:val="18"/>
+              </w:rPr>
+              <w:t xml:space="preserve">OK</w:t>
+            </w:r>
           </w:p>
         </w:tc>
       </w:tr>
@@ -1782,7 +1846,7 @@
                 <w:color w:val="333333"/>
                 <w:sz w:val="18"/>
               </w:rPr>
-              <w:t>CALIBRE: C26 · ANCHO: 48" · RECUBRIMIENTO: AZ50 · ACABADO: FR · COLOR: Blanco mate</w:t>
+              <w:t>NÚMERO DE PARTE CLIENTE: 95432 CODO 3 1/2" A 90º (deriva ANCHO 3-1/2", ACABADO ANODIZADO, ÁNGULO 90º, LONGITUD 0.8433 m, PESO 4.354 kg)</w:t>
             </w:r>
           </w:p>
         </w:tc>
@@ -1822,6 +1886,14 @@
                 <w:sz w:val="18"/>
               </w:rPr>
             </w:pPr>
+            <w:r>
+              <w:rPr>
+                <w:rFonts w:ascii="Calibri" w:hAnsi="Calibri" w:cs="Calibri"/>
+                <w:color w:val="333333"/>
+                <w:sz w:val="18"/>
+              </w:rPr>
+              <w:t xml:space="preserve">Con el nº de parte SAP derivó la especificación completa; configuración consistente.</w:t>
+            </w:r>
           </w:p>
         </w:tc>
         <w:tc>
@@ -1837,6 +1909,14 @@
                 <w:sz w:val="18"/>
               </w:rPr>
             </w:pPr>
+            <w:r>
+              <w:rPr>
+                <w:rFonts w:ascii="Calibri" w:hAnsi="Calibri" w:cs="Calibri"/>
+                <w:color w:val="333333"/>
+                <w:sz w:val="18"/>
+              </w:rPr>
+              <w:t xml:space="preserve">OK</w:t>
+            </w:r>
           </w:p>
         </w:tc>
       </w:tr>
@@ -1952,6 +2032,14 @@
                 <w:sz w:val="18"/>
               </w:rPr>
             </w:pPr>
+            <w:r>
+              <w:rPr>
+                <w:rFonts w:ascii="Calibri" w:hAnsi="Calibri" w:cs="Calibri"/>
+                <w:color w:val="333333"/>
+                <w:sz w:val="18"/>
+              </w:rPr>
+              <w:t xml:space="preserve">Pedido de Maquila 4010030435 grabado. Valor neto 825.00 MXN.</w:t>
+            </w:r>
           </w:p>
         </w:tc>
         <w:tc>
@@ -1967,6 +2055,14 @@
                 <w:sz w:val="18"/>
               </w:rPr>
             </w:pPr>
+            <w:r>
+              <w:rPr>
+                <w:rFonts w:ascii="Calibri" w:hAnsi="Calibri" w:cs="Calibri"/>
+                <w:color w:val="333333"/>
+                <w:sz w:val="18"/>
+              </w:rPr>
+              <w:t xml:space="preserve">OK</w:t>
+            </w:r>
           </w:p>
         </w:tc>
       </w:tr>

</xml_diff>